<commit_message>
chinh sua quy trinh cot loi
</commit_message>
<xml_diff>
--- a/25410329_Tuyen/25410329_rubik1.docx
+++ b/25410329_Tuyen/25410329_rubik1.docx
@@ -373,9 +373,10 @@
     </w:p>
     <w:p>
       <w:pPr>
-        <w:ind w:left="1260"/>
-        <w:rPr>
-          <w:rFonts w:ascii="Times New Roman" w:hAnsi="Times New Roman" w:cs="Times New Roman"/>
+        <w:spacing w:after="0" w:line="240" w:lineRule="auto"/>
+        <w:ind w:left="2160"/>
+        <w:rPr>
+          <w:rFonts w:ascii="Times New Roman" w:eastAsiaTheme="majorEastAsia" w:hAnsi="Times New Roman" w:cs="Times New Roman"/>
           <w:sz w:val="26"/>
           <w:szCs w:val="26"/>
           <w:lang w:val="en-US" w:eastAsia="en-US"/>
@@ -383,18 +384,61 @@
       </w:pPr>
       <w:r>
         <w:rPr>
-          <w:rFonts w:ascii="Times New Roman" w:hAnsi="Times New Roman" w:cs="Times New Roman"/>
+          <w:rFonts w:ascii="Times New Roman" w:eastAsiaTheme="majorEastAsia" w:hAnsi="Times New Roman" w:cs="Times New Roman"/>
+          <w:sz w:val="26"/>
+          <w:szCs w:val="26"/>
+          <w:lang w:val="en-US" w:eastAsia="en-US"/>
+        </w:rPr>
+        <w:t xml:space="preserve">    </w:t>
+      </w:r>
+      <w:r>
+        <w:rPr>
+          <w:rFonts w:ascii="Times New Roman" w:eastAsiaTheme="majorEastAsia" w:hAnsi="Times New Roman" w:cs="Times New Roman"/>
+          <w:sz w:val="26"/>
+          <w:szCs w:val="26"/>
+          <w:lang w:val="en-US" w:eastAsia="en-US"/>
+        </w:rPr>
+        <w:t xml:space="preserve">Quy trình Vận hành Đơn hàng Online và </w:t>
+      </w:r>
+      <w:r>
+        <w:rPr>
+          <w:rFonts w:ascii="Times New Roman" w:eastAsiaTheme="majorEastAsia" w:hAnsi="Times New Roman" w:cs="Times New Roman"/>
+          <w:sz w:val="26"/>
+          <w:szCs w:val="26"/>
+          <w:lang w:val="en-US" w:eastAsia="en-US"/>
+        </w:rPr>
+        <w:t>G</w:t>
+      </w:r>
+      <w:r>
+        <w:rPr>
+          <w:rFonts w:ascii="Times New Roman" w:eastAsiaTheme="majorEastAsia" w:hAnsi="Times New Roman" w:cs="Times New Roman"/>
+          <w:sz w:val="26"/>
+          <w:szCs w:val="26"/>
+          <w:lang w:val="en-US" w:eastAsia="en-US"/>
+        </w:rPr>
+        <w:t>iao hàng nhanh</w:t>
+      </w:r>
+    </w:p>
+    <w:p>
+      <w:pPr>
+        <w:spacing w:after="0" w:line="240" w:lineRule="auto"/>
+        <w:ind w:left="396" w:firstLine="864"/>
+        <w:rPr>
+          <w:rFonts w:ascii="Times New Roman" w:eastAsiaTheme="majorEastAsia" w:hAnsi="Times New Roman" w:cs="Times New Roman"/>
+          <w:sz w:val="26"/>
+          <w:szCs w:val="26"/>
+          <w:lang w:val="en-US" w:eastAsia="en-US"/>
+        </w:rPr>
+      </w:pPr>
+      <w:r>
+        <w:rPr>
           <w:noProof/>
-          <w:sz w:val="26"/>
-          <w:szCs w:val="26"/>
-          <w:lang w:val="en-US" w:eastAsia="en-US"/>
-          <w14:ligatures w14:val="standardContextual"/>
         </w:rPr>
         <w:drawing>
-          <wp:inline distT="0" distB="0" distL="0" distR="0" wp14:anchorId="163809A4" wp14:editId="37D5E43C">
-            <wp:extent cx="5545648" cy="822960"/>
-            <wp:effectExtent l="19050" t="19050" r="17145" b="15240"/>
-            <wp:docPr id="775836205" name="Picture 1"/>
+          <wp:inline distT="0" distB="0" distL="0" distR="0" wp14:anchorId="31D2E3CA" wp14:editId="1E9F3A38">
+            <wp:extent cx="5505450" cy="777240"/>
+            <wp:effectExtent l="0" t="0" r="0" b="3810"/>
+            <wp:docPr id="1440042989" name="Picture 1"/>
             <wp:cNvGraphicFramePr>
               <a:graphicFrameLocks xmlns:a="http://schemas.openxmlformats.org/drawingml/2006/main" noChangeAspect="1"/>
             </wp:cNvGraphicFramePr>
@@ -402,33 +446,35 @@
               <a:graphicData uri="http://schemas.openxmlformats.org/drawingml/2006/picture">
                 <pic:pic xmlns:pic="http://schemas.openxmlformats.org/drawingml/2006/picture">
                   <pic:nvPicPr>
-                    <pic:cNvPr id="775836205" name="Picture 775836205"/>
-                    <pic:cNvPicPr/>
+                    <pic:cNvPr id="0" name="Picture 1"/>
+                    <pic:cNvPicPr>
+                      <a:picLocks noChangeAspect="1" noChangeArrowheads="1"/>
+                    </pic:cNvPicPr>
                   </pic:nvPicPr>
                   <pic:blipFill>
-                    <a:blip r:embed="rId7">
+                    <a:blip r:embed="rId7" cstate="print">
                       <a:extLst>
                         <a:ext uri="{28A0092B-C50C-407E-A947-70E740481C1C}">
                           <a14:useLocalDpi xmlns:a14="http://schemas.microsoft.com/office/drawing/2010/main" val="0"/>
                         </a:ext>
                       </a:extLst>
                     </a:blip>
+                    <a:srcRect/>
                     <a:stretch>
                       <a:fillRect/>
                     </a:stretch>
                   </pic:blipFill>
-                  <pic:spPr>
+                  <pic:spPr bwMode="auto">
                     <a:xfrm>
                       <a:off x="0" y="0"/>
-                      <a:ext cx="5545648" cy="822960"/>
+                      <a:ext cx="5505450" cy="777240"/>
                     </a:xfrm>
                     <a:prstGeom prst="rect">
                       <a:avLst/>
                     </a:prstGeom>
+                    <a:noFill/>
                     <a:ln>
-                      <a:solidFill>
-                        <a:schemeClr val="accent1"/>
-                      </a:solidFill>
+                      <a:noFill/>
                     </a:ln>
                   </pic:spPr>
                 </pic:pic>
@@ -467,9 +513,10 @@
     </w:p>
     <w:p>
       <w:pPr>
-        <w:ind w:left="1260"/>
-        <w:rPr>
-          <w:rFonts w:ascii="Times New Roman" w:hAnsi="Times New Roman" w:cs="Times New Roman"/>
+        <w:spacing w:after="0" w:line="240" w:lineRule="auto"/>
+        <w:ind w:left="2016" w:firstLine="864"/>
+        <w:rPr>
+          <w:rFonts w:ascii="Times New Roman" w:eastAsiaTheme="majorEastAsia" w:hAnsi="Times New Roman" w:cs="Times New Roman"/>
           <w:sz w:val="26"/>
           <w:szCs w:val="26"/>
           <w:lang w:val="en-US" w:eastAsia="en-US"/>
@@ -477,18 +524,55 @@
       </w:pPr>
       <w:r>
         <w:rPr>
-          <w:rFonts w:ascii="Times New Roman" w:hAnsi="Times New Roman" w:cs="Times New Roman"/>
-          <w:noProof/>
+          <w:rFonts w:ascii="Times New Roman" w:eastAsiaTheme="majorEastAsia" w:hAnsi="Times New Roman" w:cs="Times New Roman"/>
           <w:sz w:val="26"/>
           <w:szCs w:val="26"/>
           <w:lang w:val="en-US" w:eastAsia="en-US"/>
-          <w14:ligatures w14:val="standardContextual"/>
+        </w:rPr>
+        <w:t xml:space="preserve"> </w:t>
+      </w:r>
+      <w:r>
+        <w:rPr>
+          <w:rFonts w:ascii="Times New Roman" w:eastAsiaTheme="majorEastAsia" w:hAnsi="Times New Roman" w:cs="Times New Roman"/>
+          <w:sz w:val="26"/>
+          <w:szCs w:val="26"/>
+          <w:lang w:val="en-US" w:eastAsia="en-US"/>
+        </w:rPr>
+        <w:t xml:space="preserve">Quy trình </w:t>
+      </w:r>
+      <w:r>
+        <w:rPr>
+          <w:rFonts w:ascii="Times New Roman" w:eastAsiaTheme="majorEastAsia" w:hAnsi="Times New Roman" w:cs="Times New Roman"/>
+          <w:sz w:val="26"/>
+          <w:szCs w:val="26"/>
+          <w:lang w:val="en-US" w:eastAsia="en-US"/>
+        </w:rPr>
+        <w:t>Quản lý ca trực và Giao ban hằng ngày</w:t>
+      </w:r>
+    </w:p>
+    <w:p>
+      <w:pPr>
+        <w:spacing w:after="0" w:line="240" w:lineRule="auto"/>
+        <w:ind w:left="630" w:firstLine="720"/>
+        <w:rPr>
+          <w:rFonts w:ascii="Times New Roman" w:hAnsi="Times New Roman" w:cs="Times New Roman"/>
+          <w:sz w:val="26"/>
+          <w:szCs w:val="26"/>
+          <w:lang w:val="en-US"/>
+        </w:rPr>
+      </w:pPr>
+      <w:r>
+        <w:rPr>
+          <w:rFonts w:ascii="Times New Roman" w:hAnsi="Times New Roman" w:cs="Times New Roman"/>
+          <w:sz w:val="26"/>
+          <w:szCs w:val="26"/>
+          <w:lang w:val="en-US"/>
         </w:rPr>
         <w:drawing>
-          <wp:inline distT="0" distB="0" distL="0" distR="0" wp14:anchorId="7889D8D3" wp14:editId="18B92AFA">
-            <wp:extent cx="5556978" cy="978408"/>
-            <wp:effectExtent l="19050" t="19050" r="24765" b="12700"/>
-            <wp:docPr id="695750100" name="Picture 5"/>
+          <wp:inline distT="0" distB="0" distL="0" distR="0" wp14:anchorId="303913B8" wp14:editId="3B3BF8B7">
+            <wp:extent cx="5505450" cy="777240"/>
+            <wp:effectExtent l="0" t="0" r="0" b="3810"/>
+            <wp:docPr id="364836021" name="Picture 3"/>
             <wp:cNvGraphicFramePr>
               <a:graphicFrameLocks xmlns:a="http://schemas.openxmlformats.org/drawingml/2006/main" noChangeAspect="1"/>
             </wp:cNvGraphicFramePr>
@@ -496,33 +580,35 @@
               <a:graphicData uri="http://schemas.openxmlformats.org/drawingml/2006/picture">
                 <pic:pic xmlns:pic="http://schemas.openxmlformats.org/drawingml/2006/picture">
                   <pic:nvPicPr>
-                    <pic:cNvPr id="695750100" name="Picture 695750100"/>
-                    <pic:cNvPicPr/>
+                    <pic:cNvPr id="0" name="Picture 8"/>
+                    <pic:cNvPicPr>
+                      <a:picLocks noChangeAspect="1" noChangeArrowheads="1"/>
+                    </pic:cNvPicPr>
                   </pic:nvPicPr>
                   <pic:blipFill>
-                    <a:blip r:embed="rId8">
+                    <a:blip r:embed="rId8" cstate="print">
                       <a:extLst>
                         <a:ext uri="{28A0092B-C50C-407E-A947-70E740481C1C}">
                           <a14:useLocalDpi xmlns:a14="http://schemas.microsoft.com/office/drawing/2010/main" val="0"/>
                         </a:ext>
                       </a:extLst>
                     </a:blip>
+                    <a:srcRect/>
                     <a:stretch>
                       <a:fillRect/>
                     </a:stretch>
                   </pic:blipFill>
-                  <pic:spPr>
+                  <pic:spPr bwMode="auto">
                     <a:xfrm>
                       <a:off x="0" y="0"/>
-                      <a:ext cx="5556978" cy="978408"/>
+                      <a:ext cx="5505450" cy="777240"/>
                     </a:xfrm>
                     <a:prstGeom prst="rect">
                       <a:avLst/>
                     </a:prstGeom>
+                    <a:noFill/>
                     <a:ln>
-                      <a:solidFill>
-                        <a:schemeClr val="accent1"/>
-                      </a:solidFill>
+                      <a:noFill/>
                     </a:ln>
                   </pic:spPr>
                 </pic:pic>
@@ -534,19 +620,18 @@
     </w:p>
     <w:p>
       <w:pPr>
-        <w:pStyle w:val="Heading1"/>
-        <w:jc w:val="center"/>
-        <w:rPr>
-          <w:rFonts w:ascii="Times New Roman" w:eastAsiaTheme="minorHAnsi" w:hAnsi="Times New Roman" w:cs="Times New Roman"/>
-          <w:color w:val="auto"/>
-          <w:sz w:val="26"/>
-          <w:szCs w:val="26"/>
-        </w:rPr>
-      </w:pPr>
-      <w:r>
-        <w:rPr>
-          <w:rFonts w:ascii="Times New Roman" w:hAnsi="Times New Roman" w:cs="Times New Roman"/>
-          <w:color w:val="auto"/>
+        <w:spacing w:after="0" w:line="240" w:lineRule="auto"/>
+        <w:ind w:left="1350" w:firstLine="864"/>
+        <w:rPr>
+          <w:rFonts w:ascii="Times New Roman" w:eastAsiaTheme="majorEastAsia" w:hAnsi="Times New Roman" w:cs="Times New Roman"/>
+          <w:sz w:val="26"/>
+          <w:szCs w:val="26"/>
+          <w:lang w:val="en-US" w:eastAsia="en-US"/>
+        </w:rPr>
+      </w:pPr>
+      <w:r>
+        <w:rPr>
+          <w:rFonts w:ascii="Times New Roman" w:hAnsi="Times New Roman" w:cs="Times New Roman"/>
           <w:sz w:val="26"/>
           <w:szCs w:val="26"/>
         </w:rPr>
@@ -557,7 +642,6 @@
           <w:rFonts w:ascii="Times New Roman" w:eastAsia="Times New Roman" w:hAnsi="Times New Roman" w:cs="Times New Roman"/>
           <w:b/>
           <w:bCs/>
-          <w:color w:val="auto"/>
           <w:sz w:val="32"/>
           <w:szCs w:val="32"/>
         </w:rPr>
@@ -569,7 +653,6 @@
           <w:rFonts w:ascii="Times New Roman" w:eastAsia="Times New Roman" w:hAnsi="Times New Roman" w:cs="Times New Roman"/>
           <w:b/>
           <w:bCs/>
-          <w:color w:val="auto"/>
           <w:sz w:val="32"/>
           <w:szCs w:val="32"/>
         </w:rPr>
@@ -580,7 +663,6 @@
           <w:rFonts w:ascii="Times New Roman" w:eastAsia="Times New Roman" w:hAnsi="Times New Roman" w:cs="Times New Roman"/>
           <w:b/>
           <w:bCs/>
-          <w:color w:val="auto"/>
           <w:sz w:val="32"/>
           <w:szCs w:val="32"/>
         </w:rPr>
@@ -589,7 +671,6 @@
       <w:r>
         <w:rPr>
           <w:rFonts w:ascii="Times New Roman" w:eastAsia="Times New Roman" w:hAnsi="Times New Roman" w:cs="Times New Roman"/>
-          <w:color w:val="auto"/>
           <w:sz w:val="26"/>
           <w:szCs w:val="26"/>
         </w:rPr>
@@ -7951,7 +8032,7 @@
   <w:style w:type="paragraph" w:default="1" w:styleId="Normal">
     <w:name w:val="Normal"/>
     <w:qFormat/>
-    <w:rsid w:val="00E47203"/>
+    <w:rsid w:val="003E137F"/>
     <w:rPr>
       <w:rFonts w:ascii="Aptos" w:eastAsia="Aptos" w:hAnsi="Aptos" w:cs="Aptos"/>
       <w:kern w:val="0"/>
@@ -8183,7 +8264,6 @@
   <w:style w:type="character" w:default="1" w:styleId="DefaultParagraphFont">
     <w:name w:val="Default Paragraph Font"/>
     <w:uiPriority w:val="1"/>
-    <w:semiHidden/>
     <w:unhideWhenUsed/>
   </w:style>
   <w:style w:type="table" w:default="1" w:styleId="TableNormal">

</xml_diff>